<commit_message>
System PCE Full plan doc: add appendix on how a paired workload reaches the Console view
Co-Authored-By: Claude Opus 5.5 <noreply@anthropic.com>
</commit_message>
<xml_diff>
--- a/System PCE Full/docs/26x System PCE Full - Plan.docx
+++ b/System PCE Full/docs/26x System PCE Full - Plan.docx
@@ -1595,6 +1595,1130 @@
         <w:rPr>
           <w:rFonts w:ascii="Calibri" w:cs="Calibri" w:eastAsia="Calibri" w:hAnsi="Calibri"/>
         </w:rPr>
+        <w:t xml:space="preserve">Appendix: How a paired workload reaches the Console view</w:t>
+      </w:r>
+    </w:p>
+    <w:p>
+      <w:pPr>
+        <w:spacing w:after="120"/>
+      </w:pPr>
+      <w:r>
+        <w:rPr>
+          <w:rFonts w:ascii="Calibri" w:cs="Calibri" w:eastAsia="Calibri" w:hAnsi="Calibri"/>
+        </w:rPr>
+        <w:t xml:space="preserve">The full path, from pressing Enter in the </w:t>
+      </w:r>
+      <w:r>
+        <w:rPr>
+          <w:rFonts w:ascii="Calibri" w:cs="Calibri" w:eastAsia="Calibri" w:hAnsi="Calibri"/>
+          <w:b/>
+          <w:bCs/>
+        </w:rPr>
+        <w:t xml:space="preserve">Linux</w:t>
+      </w:r>
+      <w:r>
+        <w:rPr>
+          <w:rFonts w:ascii="Calibri" w:cs="Calibri" w:eastAsia="Calibri" w:hAnsi="Calibri"/>
+        </w:rPr>
+        <w:t xml:space="preserve"> tab to linux-ven-01 appearing in the </w:t>
+      </w:r>
+      <w:r>
+        <w:rPr>
+          <w:rFonts w:ascii="Calibri" w:cs="Calibri" w:eastAsia="Calibri" w:hAnsi="Calibri"/>
+          <w:b/>
+          <w:bCs/>
+        </w:rPr>
+        <w:t xml:space="preserve">Console</w:t>
+      </w:r>
+      <w:r>
+        <w:rPr>
+          <w:rFonts w:ascii="Calibri" w:cs="Calibri" w:eastAsia="Calibri" w:hAnsi="Calibri"/>
+        </w:rPr>
+        <w:t xml:space="preserve"> tab. File references are in </w:t>
+      </w:r>
+      <w:r>
+        <w:rPr>
+          <w:rFonts w:ascii="Consolas" w:cs="Consolas" w:eastAsia="Consolas" w:hAnsi="Consolas"/>
+          <w:sz w:val="20"/>
+          <w:szCs w:val="20"/>
+        </w:rPr>
+        <w:t xml:space="preserve">src/js/</w:t>
+      </w:r>
+      <w:r>
+        <w:rPr>
+          <w:rFonts w:ascii="Calibri" w:cs="Calibri" w:eastAsia="Calibri" w:hAnsi="Calibri"/>
+        </w:rPr>
+        <w:t xml:space="preserve">.</w:t>
+      </w:r>
+    </w:p>
+    <w:p>
+      <w:pPr>
+        <w:pStyle w:val="Heading2"/>
+        <w:spacing w:after="100" w:before="200"/>
+      </w:pPr>
+      <w:r>
+        <w:rPr>
+          <w:rFonts w:ascii="Calibri" w:cs="Calibri" w:eastAsia="Calibri" w:hAnsi="Calibri"/>
+        </w:rPr>
+        <w:t xml:space="preserve">In the Linux tab (linux.html)</w:t>
+      </w:r>
+    </w:p>
+    <w:p>
+      <w:pPr>
+        <w:pStyle w:val="ListParagraph"/>
+        <w:numPr>
+          <w:ilvl w:val="0"/>
+          <w:numId w:val="6"/>
+        </w:numPr>
+        <w:spacing w:after="60"/>
+      </w:pPr>
+      <w:r>
+        <w:rPr>
+          <w:rFonts w:ascii="Calibri" w:cs="Calibri" w:eastAsia="Calibri" w:hAnsi="Calibri"/>
+          <w:b/>
+          <w:bCs/>
+        </w:rPr>
+        <w:t xml:space="preserve">Enter is pressed.</w:t>
+      </w:r>
+      <w:r>
+        <w:rPr>
+          <w:rFonts w:ascii="Calibri" w:cs="Calibri" w:eastAsia="Calibri" w:hAnsi="Calibri"/>
+        </w:rPr>
+        <w:t xml:space="preserve"> A keydown listener on the terminal input catches it (</w:t>
+      </w:r>
+      <w:r>
+        <w:rPr>
+          <w:rFonts w:ascii="Consolas" w:cs="Consolas" w:eastAsia="Consolas" w:hAnsi="Consolas"/>
+          <w:sz w:val="20"/>
+          <w:szCs w:val="20"/>
+        </w:rPr>
+        <w:t xml:space="preserve">16-terminal-engine.js:74</w:t>
+      </w:r>
+      <w:r>
+        <w:rPr>
+          <w:rFonts w:ascii="Calibri" w:cs="Calibri" w:eastAsia="Calibri" w:hAnsi="Calibri"/>
+        </w:rPr>
+        <w:t xml:space="preserve">). It hides the input while the command runs and calls </w:t>
+      </w:r>
+      <w:r>
+        <w:rPr>
+          <w:rFonts w:ascii="Consolas" w:cs="Consolas" w:eastAsia="Consolas" w:hAnsi="Consolas"/>
+          <w:sz w:val="20"/>
+          <w:szCs w:val="20"/>
+        </w:rPr>
+        <w:t xml:space="preserve">runCommand(text)</w:t>
+      </w:r>
+      <w:r>
+        <w:rPr>
+          <w:rFonts w:ascii="Calibri" w:cs="Calibri" w:eastAsia="Calibri" w:hAnsi="Calibri"/>
+        </w:rPr>
+        <w:t xml:space="preserve">.</w:t>
+      </w:r>
+    </w:p>
+    <w:p>
+      <w:pPr>
+        <w:pStyle w:val="ListParagraph"/>
+        <w:numPr>
+          <w:ilvl w:val="0"/>
+          <w:numId w:val="6"/>
+        </w:numPr>
+        <w:spacing w:after="60"/>
+      </w:pPr>
+      <w:r>
+        <w:rPr>
+          <w:rFonts w:ascii="Calibri" w:cs="Calibri" w:eastAsia="Calibri" w:hAnsi="Calibri"/>
+          <w:b/>
+          <w:bCs/>
+        </w:rPr>
+        <w:t xml:space="preserve">runCommand reads the latest state</w:t>
+      </w:r>
+      <w:r>
+        <w:rPr>
+          <w:rFonts w:ascii="Calibri" w:cs="Calibri" w:eastAsia="Calibri" w:hAnsi="Calibri"/>
+        </w:rPr>
+        <w:t xml:space="preserve"> (</w:t>
+      </w:r>
+      <w:r>
+        <w:rPr>
+          <w:rFonts w:ascii="Consolas" w:cs="Consolas" w:eastAsia="Consolas" w:hAnsi="Consolas"/>
+          <w:sz w:val="20"/>
+          <w:szCs w:val="20"/>
+        </w:rPr>
+        <w:t xml:space="preserve">16-terminal-engine.js:44</w:t>
+      </w:r>
+      <w:r>
+        <w:rPr>
+          <w:rFonts w:ascii="Calibri" w:cs="Calibri" w:eastAsia="Calibri" w:hAnsi="Calibri"/>
+        </w:rPr>
+        <w:t xml:space="preserve">).</w:t>
+      </w:r>
+    </w:p>
+    <w:p>
+      <w:pPr>
+        <w:pStyle w:val="ListParagraph"/>
+        <w:numPr>
+          <w:ilvl w:val="1"/>
+          <w:numId w:val="4"/>
+        </w:numPr>
+        <w:spacing w:after="60"/>
+      </w:pPr>
+      <w:r>
+        <w:rPr>
+          <w:rFonts w:ascii="Calibri" w:cs="Calibri" w:eastAsia="Calibri" w:hAnsi="Calibri"/>
+        </w:rPr>
+        <w:t xml:space="preserve">It first calls </w:t>
+      </w:r>
+      <w:r>
+        <w:rPr>
+          <w:rFonts w:ascii="Consolas" w:cs="Consolas" w:eastAsia="Consolas" w:hAnsi="Consolas"/>
+          <w:sz w:val="20"/>
+          <w:szCs w:val="20"/>
+        </w:rPr>
+        <w:t xml:space="preserve">load()</w:t>
+      </w:r>
+      <w:r>
+        <w:rPr>
+          <w:rFonts w:ascii="Calibri" w:cs="Calibri" w:eastAsia="Calibri" w:hAnsi="Calibri"/>
+        </w:rPr>
+        <w:t xml:space="preserve"> (</w:t>
+      </w:r>
+      <w:r>
+        <w:rPr>
+          <w:rFonts w:ascii="Consolas" w:cs="Consolas" w:eastAsia="Consolas" w:hAnsi="Consolas"/>
+          <w:sz w:val="20"/>
+          <w:szCs w:val="20"/>
+        </w:rPr>
+        <w:t xml:space="preserve">90-tabs-store-init.js:19</w:t>
+      </w:r>
+      <w:r>
+        <w:rPr>
+          <w:rFonts w:ascii="Calibri" w:cs="Calibri" w:eastAsia="Calibri" w:hAnsi="Calibri"/>
+        </w:rPr>
+        <w:t xml:space="preserve">), which reads the shared state from localStorage, so it sees the key the Console generated a moment ago.</w:t>
+      </w:r>
+    </w:p>
+    <w:p>
+      <w:pPr>
+        <w:pStyle w:val="ListParagraph"/>
+        <w:numPr>
+          <w:ilvl w:val="1"/>
+          <w:numId w:val="4"/>
+        </w:numPr>
+        <w:spacing w:after="60"/>
+      </w:pPr>
+      <w:r>
+        <w:rPr>
+          <w:rFonts w:ascii="Calibri" w:cs="Calibri" w:eastAsia="Calibri" w:hAnsi="Calibri"/>
+        </w:rPr>
+        <w:t xml:space="preserve">It works out what was pasted: a Linux </w:t>
+      </w:r>
+      <w:r>
+        <w:rPr>
+          <w:rFonts w:ascii="Consolas" w:cs="Consolas" w:eastAsia="Consolas" w:hAnsi="Consolas"/>
+          <w:sz w:val="20"/>
+          <w:szCs w:val="20"/>
+        </w:rPr>
+        <w:t xml:space="preserve">pair.sh</w:t>
+      </w:r>
+      <w:r>
+        <w:rPr>
+          <w:rFonts w:ascii="Calibri" w:cs="Calibri" w:eastAsia="Calibri" w:hAnsi="Calibri"/>
+        </w:rPr>
+        <w:t xml:space="preserve"> script, a PowerShell or macOS one, or something else.</w:t>
+      </w:r>
+    </w:p>
+    <w:p>
+      <w:pPr>
+        <w:pStyle w:val="ListParagraph"/>
+        <w:numPr>
+          <w:ilvl w:val="1"/>
+          <w:numId w:val="4"/>
+        </w:numPr>
+        <w:spacing w:after="60"/>
+      </w:pPr>
+      <w:r>
+        <w:rPr>
+          <w:rFonts w:ascii="Calibri" w:cs="Calibri" w:eastAsia="Calibri" w:hAnsi="Calibri"/>
+        </w:rPr>
+        <w:t xml:space="preserve">It pulls out the </w:t>
+      </w:r>
+      <w:r>
+        <w:rPr>
+          <w:rFonts w:ascii="Consolas" w:cs="Consolas" w:eastAsia="Consolas" w:hAnsi="Consolas"/>
+          <w:sz w:val="20"/>
+          <w:szCs w:val="20"/>
+        </w:rPr>
+        <w:t xml:space="preserve">--activation-code</w:t>
+      </w:r>
+      <w:r>
+        <w:rPr>
+          <w:rFonts w:ascii="Calibri" w:cs="Calibri" w:eastAsia="Calibri" w:hAnsi="Calibri"/>
+        </w:rPr>
+        <w:t xml:space="preserve">.</w:t>
+      </w:r>
+    </w:p>
+    <w:p>
+      <w:pPr>
+        <w:spacing w:after="120"/>
+      </w:pPr>
+      <w:r>
+        <w:rPr>
+          <w:rFonts w:ascii="Calibri" w:cs="Calibri" w:eastAsia="Calibri" w:hAnsi="Calibri"/>
+          <w:b/>
+          <w:bCs/>
+        </w:rPr>
+        <w:t xml:space="preserve">3. It validates the key.</w:t>
+      </w:r>
+      <w:r>
+        <w:rPr>
+          <w:rFonts w:ascii="Calibri" w:cs="Calibri" w:eastAsia="Calibri" w:hAnsi="Calibri"/>
+        </w:rPr>
+        <w:t xml:space="preserve"> It looks the code up in </w:t>
+      </w:r>
+      <w:r>
+        <w:rPr>
+          <w:rFonts w:ascii="Consolas" w:cs="Consolas" w:eastAsia="Consolas" w:hAnsi="Consolas"/>
+          <w:sz w:val="20"/>
+          <w:szCs w:val="20"/>
+        </w:rPr>
+        <w:t xml:space="preserve">state.keys</w:t>
+      </w:r>
+      <w:r>
+        <w:rPr>
+          <w:rFonts w:ascii="Calibri" w:cs="Calibri" w:eastAsia="Calibri" w:hAnsi="Calibri"/>
+        </w:rPr>
+        <w:t xml:space="preserve"> and finds its pairing profile, then checks four things:</w:t>
+      </w:r>
+    </w:p>
+    <w:p>
+      <w:pPr>
+        <w:pStyle w:val="ListParagraph"/>
+        <w:numPr>
+          <w:ilvl w:val="1"/>
+          <w:numId w:val="4"/>
+        </w:numPr>
+        <w:spacing w:after="60"/>
+      </w:pPr>
+      <w:r>
+        <w:rPr>
+          <w:rFonts w:ascii="Calibri" w:cs="Calibri" w:eastAsia="Calibri" w:hAnsi="Calibri"/>
+        </w:rPr>
+        <w:t xml:space="preserve">Is the profile running?</w:t>
+      </w:r>
+    </w:p>
+    <w:p>
+      <w:pPr>
+        <w:pStyle w:val="ListParagraph"/>
+        <w:numPr>
+          <w:ilvl w:val="1"/>
+          <w:numId w:val="4"/>
+        </w:numPr>
+        <w:spacing w:after="60"/>
+      </w:pPr>
+      <w:r>
+        <w:rPr>
+          <w:rFonts w:ascii="Calibri" w:cs="Calibri" w:eastAsia="Calibri" w:hAnsi="Calibri"/>
+        </w:rPr>
+        <w:t xml:space="preserve">Is the key unexpired?</w:t>
+      </w:r>
+    </w:p>
+    <w:p>
+      <w:pPr>
+        <w:pStyle w:val="ListParagraph"/>
+        <w:numPr>
+          <w:ilvl w:val="1"/>
+          <w:numId w:val="4"/>
+        </w:numPr>
+        <w:spacing w:after="60"/>
+      </w:pPr>
+      <w:r>
+        <w:rPr>
+          <w:rFonts w:ascii="Calibri" w:cs="Calibri" w:eastAsia="Calibri" w:hAnsi="Calibri"/>
+        </w:rPr>
+        <w:t xml:space="preserve">Does it have uses left?</w:t>
+      </w:r>
+    </w:p>
+    <w:p>
+      <w:pPr>
+        <w:pStyle w:val="ListParagraph"/>
+        <w:numPr>
+          <w:ilvl w:val="1"/>
+          <w:numId w:val="4"/>
+        </w:numPr>
+        <w:spacing w:after="60"/>
+      </w:pPr>
+      <w:r>
+        <w:rPr>
+          <w:rFonts w:ascii="Calibri" w:cs="Calibri" w:eastAsia="Calibri" w:hAnsi="Calibri"/>
+        </w:rPr>
+        <w:t xml:space="preserve">Is this host already paired?</w:t>
+      </w:r>
+    </w:p>
+    <w:p>
+      <w:pPr>
+        <w:spacing w:after="120"/>
+      </w:pPr>
+      <w:r>
+        <w:rPr>
+          <w:rFonts w:ascii="Calibri" w:cs="Calibri" w:eastAsia="Calibri" w:hAnsi="Calibri"/>
+        </w:rPr>
+        <w:t xml:space="preserve">If any fail, it prints the matching error and stops.</w:t>
+      </w:r>
+    </w:p>
+    <w:p>
+      <w:pPr>
+        <w:spacing w:after="120"/>
+      </w:pPr>
+      <w:r>
+        <w:rPr>
+          <w:rFonts w:ascii="Calibri" w:cs="Calibri" w:eastAsia="Calibri" w:hAnsi="Calibri"/>
+          <w:b/>
+          <w:bCs/>
+        </w:rPr>
+        <w:t xml:space="preserve">4. It plays the install log.</w:t>
+      </w:r>
+      <w:r>
+        <w:rPr>
+          <w:rFonts w:ascii="Calibri" w:cs="Calibri" w:eastAsia="Calibri" w:hAnsi="Calibri"/>
+        </w:rPr>
+        <w:t xml:space="preserve"> </w:t>
+      </w:r>
+      <w:r>
+        <w:rPr>
+          <w:rFonts w:ascii="Consolas" w:cs="Consolas" w:eastAsia="Consolas" w:hAnsi="Consolas"/>
+          <w:sz w:val="20"/>
+          <w:szCs w:val="20"/>
+        </w:rPr>
+        <w:t xml:space="preserve">stream(venSuccess('linux', profile), …)</w:t>
+      </w:r>
+      <w:r>
+        <w:rPr>
+          <w:rFonts w:ascii="Calibri" w:cs="Calibri" w:eastAsia="Calibri" w:hAnsi="Calibri"/>
+        </w:rPr>
+        <w:t xml:space="preserve"> (</w:t>
+      </w:r>
+      <w:r>
+        <w:rPr>
+          <w:rFonts w:ascii="Consolas" w:cs="Consolas" w:eastAsia="Consolas" w:hAnsi="Consolas"/>
+          <w:sz w:val="20"/>
+          <w:szCs w:val="20"/>
+        </w:rPr>
+        <w:t xml:space="preserve">16-terminal-engine.js:22</w:t>
+      </w:r>
+      <w:r>
+        <w:rPr>
+          <w:rFonts w:ascii="Calibri" w:cs="Calibri" w:eastAsia="Calibri" w:hAnsi="Calibri"/>
+        </w:rPr>
+        <w:t xml:space="preserve">) prints the real install output line by line from </w:t>
+      </w:r>
+      <w:r>
+        <w:rPr>
+          <w:rFonts w:ascii="Consolas" w:cs="Consolas" w:eastAsia="Consolas" w:hAnsi="Consolas"/>
+          <w:sz w:val="20"/>
+          <w:szCs w:val="20"/>
+        </w:rPr>
+        <w:t xml:space="preserve">15-ven-output.js:4</w:t>
+      </w:r>
+      <w:r>
+        <w:rPr>
+          <w:rFonts w:ascii="Calibri" w:cs="Calibri" w:eastAsia="Calibri" w:hAnsi="Calibri"/>
+        </w:rPr>
+        <w:t xml:space="preserve">, with the "Installing Illumio Packages" pause. Partway through, the line list contains a marker, </w:t>
+      </w:r>
+      <w:r>
+        <w:rPr>
+          <w:rFonts w:ascii="Consolas" w:cs="Consolas" w:eastAsia="Consolas" w:hAnsi="Consolas"/>
+          <w:sz w:val="20"/>
+          <w:szCs w:val="20"/>
+        </w:rPr>
+        <w:t xml:space="preserve">{pair:true}</w:t>
+      </w:r>
+      <w:r>
+        <w:rPr>
+          <w:rFonts w:ascii="Calibri" w:cs="Calibri" w:eastAsia="Calibri" w:hAnsi="Calibri"/>
+        </w:rPr>
+        <w:t xml:space="preserve"> (</w:t>
+      </w:r>
+      <w:r>
+        <w:rPr>
+          <w:rFonts w:ascii="Consolas" w:cs="Consolas" w:eastAsia="Consolas" w:hAnsi="Consolas"/>
+          <w:sz w:val="20"/>
+          <w:szCs w:val="20"/>
+        </w:rPr>
+        <w:t xml:space="preserve">15-ven-output.js:27</w:t>
+      </w:r>
+      <w:r>
+        <w:rPr>
+          <w:rFonts w:ascii="Calibri" w:cs="Calibri" w:eastAsia="Calibri" w:hAnsi="Calibri"/>
+        </w:rPr>
+        <w:t xml:space="preserve">), placed at the "Pairing with Illumio" point.</w:t>
+      </w:r>
+    </w:p>
+    <w:p>
+      <w:pPr>
+        <w:spacing w:after="120"/>
+      </w:pPr>
+      <w:r>
+        <w:rPr>
+          <w:rFonts w:ascii="Calibri" w:cs="Calibri" w:eastAsia="Calibri" w:hAnsi="Calibri"/>
+          <w:b/>
+          <w:bCs/>
+        </w:rPr>
+        <w:t xml:space="preserve">5. At that marker it adds the workload.</w:t>
+      </w:r>
+      <w:r>
+        <w:rPr>
+          <w:rFonts w:ascii="Calibri" w:cs="Calibri" w:eastAsia="Calibri" w:hAnsi="Calibri"/>
+        </w:rPr>
+        <w:t xml:space="preserve"> </w:t>
+      </w:r>
+      <w:r>
+        <w:rPr>
+          <w:rFonts w:ascii="Consolas" w:cs="Consolas" w:eastAsia="Consolas" w:hAnsi="Consolas"/>
+          <w:sz w:val="20"/>
+          <w:szCs w:val="20"/>
+        </w:rPr>
+        <w:t xml:space="preserve">stream</w:t>
+      </w:r>
+      <w:r>
+        <w:rPr>
+          <w:rFonts w:ascii="Calibri" w:cs="Calibri" w:eastAsia="Calibri" w:hAnsi="Calibri"/>
+        </w:rPr>
+        <w:t xml:space="preserve"> calls </w:t>
+      </w:r>
+      <w:r>
+        <w:rPr>
+          <w:rFonts w:ascii="Consolas" w:cs="Consolas" w:eastAsia="Consolas" w:hAnsi="Consolas"/>
+          <w:sz w:val="20"/>
+          <w:szCs w:val="20"/>
+        </w:rPr>
+        <w:t xml:space="preserve">pairWorkload('linux', key)</w:t>
+      </w:r>
+      <w:r>
+        <w:rPr>
+          <w:rFonts w:ascii="Calibri" w:cs="Calibri" w:eastAsia="Calibri" w:hAnsi="Calibri"/>
+        </w:rPr>
+        <w:t xml:space="preserve"> (</w:t>
+      </w:r>
+      <w:r>
+        <w:rPr>
+          <w:rFonts w:ascii="Consolas" w:cs="Consolas" w:eastAsia="Consolas" w:hAnsi="Consolas"/>
+          <w:sz w:val="20"/>
+          <w:szCs w:val="20"/>
+        </w:rPr>
+        <w:t xml:space="preserve">16-terminal-engine.js:37</w:t>
+      </w:r>
+      <w:r>
+        <w:rPr>
+          <w:rFonts w:ascii="Calibri" w:cs="Calibri" w:eastAsia="Calibri" w:hAnsi="Calibri"/>
+        </w:rPr>
+        <w:t xml:space="preserve">), which:</w:t>
+      </w:r>
+    </w:p>
+    <w:p>
+      <w:pPr>
+        <w:pStyle w:val="ListParagraph"/>
+        <w:numPr>
+          <w:ilvl w:val="1"/>
+          <w:numId w:val="4"/>
+        </w:numPr>
+        <w:spacing w:after="60"/>
+      </w:pPr>
+      <w:r>
+        <w:rPr>
+          <w:rFonts w:ascii="Calibri" w:cs="Calibri" w:eastAsia="Calibri" w:hAnsi="Calibri"/>
+        </w:rPr>
+        <w:t xml:space="preserve">builds </w:t>
+      </w:r>
+      <w:r>
+        <w:rPr>
+          <w:rFonts w:ascii="Consolas" w:cs="Consolas" w:eastAsia="Consolas" w:hAnsi="Consolas"/>
+          <w:sz w:val="20"/>
+          <w:szCs w:val="20"/>
+        </w:rPr>
+        <w:t xml:space="preserve">{hostname: 'linux-ven-01', os: 'linux', profile, labels, enforcement, visibility, version, paired: &lt;time&gt;}</w:t>
+      </w:r>
+    </w:p>
+    <w:p>
+      <w:pPr>
+        <w:pStyle w:val="ListParagraph"/>
+        <w:numPr>
+          <w:ilvl w:val="1"/>
+          <w:numId w:val="4"/>
+        </w:numPr>
+        <w:spacing w:after="60"/>
+      </w:pPr>
+      <w:r>
+        <w:rPr>
+          <w:rFonts w:ascii="Calibri" w:cs="Calibri" w:eastAsia="Calibri" w:hAnsi="Calibri"/>
+        </w:rPr>
+        <w:t xml:space="preserve">pushes it into </w:t>
+      </w:r>
+      <w:r>
+        <w:rPr>
+          <w:rFonts w:ascii="Consolas" w:cs="Consolas" w:eastAsia="Consolas" w:hAnsi="Consolas"/>
+          <w:sz w:val="20"/>
+          <w:szCs w:val="20"/>
+        </w:rPr>
+        <w:t xml:space="preserve">state.workloads</w:t>
+      </w:r>
+    </w:p>
+    <w:p>
+      <w:pPr>
+        <w:pStyle w:val="ListParagraph"/>
+        <w:numPr>
+          <w:ilvl w:val="1"/>
+          <w:numId w:val="4"/>
+        </w:numPr>
+        <w:spacing w:after="60"/>
+      </w:pPr>
+      <w:r>
+        <w:rPr>
+          <w:rFonts w:ascii="Calibri" w:cs="Calibri" w:eastAsia="Calibri" w:hAnsi="Calibri"/>
+        </w:rPr>
+        <w:t xml:space="preserve">adds one to the key's use count and stamps the profile's "Last Used On"</w:t>
+      </w:r>
+    </w:p>
+    <w:p>
+      <w:pPr>
+        <w:pStyle w:val="ListParagraph"/>
+        <w:numPr>
+          <w:ilvl w:val="1"/>
+          <w:numId w:val="4"/>
+        </w:numPr>
+        <w:spacing w:after="60"/>
+      </w:pPr>
+      <w:r>
+        <w:rPr>
+          <w:rFonts w:ascii="Calibri" w:cs="Calibri" w:eastAsia="Calibri" w:hAnsi="Calibri"/>
+        </w:rPr>
+        <w:t xml:space="preserve">calls </w:t>
+      </w:r>
+      <w:r>
+        <w:rPr>
+          <w:rFonts w:ascii="Consolas" w:cs="Consolas" w:eastAsia="Consolas" w:hAnsi="Consolas"/>
+          <w:sz w:val="20"/>
+          <w:szCs w:val="20"/>
+        </w:rPr>
+        <w:t xml:space="preserve">save()</w:t>
+      </w:r>
+    </w:p>
+    <w:p>
+      <w:pPr>
+        <w:spacing w:after="120"/>
+      </w:pPr>
+      <w:r>
+        <w:rPr>
+          <w:rFonts w:ascii="Calibri" w:cs="Calibri" w:eastAsia="Calibri" w:hAnsi="Calibri"/>
+          <w:b/>
+          <w:bCs/>
+        </w:rPr>
+        <w:t xml:space="preserve">6. save() writes and broadcasts</w:t>
+      </w:r>
+      <w:r>
+        <w:rPr>
+          <w:rFonts w:ascii="Calibri" w:cs="Calibri" w:eastAsia="Calibri" w:hAnsi="Calibri"/>
+        </w:rPr>
+        <w:t xml:space="preserve"> (</w:t>
+      </w:r>
+      <w:r>
+        <w:rPr>
+          <w:rFonts w:ascii="Consolas" w:cs="Consolas" w:eastAsia="Consolas" w:hAnsi="Consolas"/>
+          <w:sz w:val="20"/>
+          <w:szCs w:val="20"/>
+        </w:rPr>
+        <w:t xml:space="preserve">90-tabs-store-init.js:9</w:t>
+      </w:r>
+      <w:r>
+        <w:rPr>
+          <w:rFonts w:ascii="Calibri" w:cs="Calibri" w:eastAsia="Calibri" w:hAnsi="Calibri"/>
+        </w:rPr>
+        <w:t xml:space="preserve">). It does three things:</w:t>
+      </w:r>
+    </w:p>
+    <w:p>
+      <w:pPr>
+        <w:pStyle w:val="ListParagraph"/>
+        <w:numPr>
+          <w:ilvl w:val="1"/>
+          <w:numId w:val="4"/>
+        </w:numPr>
+        <w:spacing w:after="60"/>
+      </w:pPr>
+      <w:r>
+        <w:rPr>
+          <w:rFonts w:ascii="Consolas" w:cs="Consolas" w:eastAsia="Consolas" w:hAnsi="Consolas"/>
+          <w:sz w:val="20"/>
+          <w:szCs w:val="20"/>
+        </w:rPr>
+        <w:t xml:space="preserve">snapshot()</w:t>
+      </w:r>
+      <w:r>
+        <w:rPr>
+          <w:rFonts w:ascii="Calibri" w:cs="Calibri" w:eastAsia="Calibri" w:hAnsi="Calibri"/>
+        </w:rPr>
+        <w:t xml:space="preserve"> serialises the whole state, and the result is written to localStorage (key </w:t>
+      </w:r>
+      <w:r>
+        <w:rPr>
+          <w:rFonts w:ascii="Consolas" w:cs="Consolas" w:eastAsia="Consolas" w:hAnsi="Consolas"/>
+          <w:sz w:val="20"/>
+          <w:szCs w:val="20"/>
+        </w:rPr>
+        <w:t xml:space="preserve">illumio-pce-lab-v1</w:t>
+      </w:r>
+      <w:r>
+        <w:rPr>
+          <w:rFonts w:ascii="Calibri" w:cs="Calibri" w:eastAsia="Calibri" w:hAnsi="Calibri"/>
+        </w:rPr>
+        <w:t xml:space="preserve">).</w:t>
+      </w:r>
+    </w:p>
+    <w:p>
+      <w:pPr>
+        <w:pStyle w:val="ListParagraph"/>
+        <w:numPr>
+          <w:ilvl w:val="1"/>
+          <w:numId w:val="4"/>
+        </w:numPr>
+        <w:spacing w:after="60"/>
+      </w:pPr>
+      <w:r>
+        <w:rPr>
+          <w:rFonts w:ascii="Consolas" w:cs="Consolas" w:eastAsia="Consolas" w:hAnsi="Consolas"/>
+          <w:sz w:val="20"/>
+          <w:szCs w:val="20"/>
+        </w:rPr>
+        <w:t xml:space="preserve">BroadcastChannel.postMessage(snapshot)</w:t>
+      </w:r>
+      <w:r>
+        <w:rPr>
+          <w:rFonts w:ascii="Calibri" w:cs="Calibri" w:eastAsia="Calibri" w:hAnsi="Calibri"/>
+        </w:rPr>
+        <w:t xml:space="preserve"> pushes it to every other open tab immediately.</w:t>
+      </w:r>
+    </w:p>
+    <w:p>
+      <w:pPr>
+        <w:pStyle w:val="ListParagraph"/>
+        <w:numPr>
+          <w:ilvl w:val="1"/>
+          <w:numId w:val="4"/>
+        </w:numPr>
+        <w:spacing w:after="60"/>
+      </w:pPr>
+      <w:r>
+        <w:rPr>
+          <w:rFonts w:ascii="Consolas" w:cs="Consolas" w:eastAsia="Consolas" w:hAnsi="Consolas"/>
+          <w:sz w:val="20"/>
+          <w:szCs w:val="20"/>
+        </w:rPr>
+        <w:t xml:space="preserve">report()</w:t>
+      </w:r>
+      <w:r>
+        <w:rPr>
+          <w:rFonts w:ascii="Calibri" w:cs="Calibri" w:eastAsia="Calibri" w:hAnsi="Calibri"/>
+        </w:rPr>
+        <w:t xml:space="preserve"> sends the one-way </w:t>
+      </w:r>
+      <w:r>
+        <w:rPr>
+          <w:rFonts w:ascii="Consolas" w:cs="Consolas" w:eastAsia="Consolas" w:hAnsi="Consolas"/>
+          <w:sz w:val="20"/>
+          <w:szCs w:val="20"/>
+        </w:rPr>
+        <w:t xml:space="preserve">POST /api/state</w:t>
+      </w:r>
+      <w:r>
+        <w:rPr>
+          <w:rFonts w:ascii="Calibri" w:cs="Calibri" w:eastAsia="Calibri" w:hAnsi="Calibri"/>
+        </w:rPr>
+        <w:t xml:space="preserve"> to the lab server, for the check scripts only.</w:t>
+      </w:r>
+    </w:p>
+    <w:p>
+      <w:pPr>
+        <w:pStyle w:val="Heading2"/>
+        <w:spacing w:after="100" w:before="200"/>
+      </w:pPr>
+      <w:r>
+        <w:rPr>
+          <w:rFonts w:ascii="Calibri" w:cs="Calibri" w:eastAsia="Calibri" w:hAnsi="Calibri"/>
+        </w:rPr>
+        <w:t xml:space="preserve">In the Console tab (index.html)</w:t>
+      </w:r>
+    </w:p>
+    <w:p>
+      <w:pPr>
+        <w:spacing w:after="120"/>
+      </w:pPr>
+      <w:r>
+        <w:rPr>
+          <w:rFonts w:ascii="Calibri" w:cs="Calibri" w:eastAsia="Calibri" w:hAnsi="Calibri"/>
+          <w:b/>
+          <w:bCs/>
+        </w:rPr>
+        <w:t xml:space="preserve">7. The Console receives the change.</w:t>
+      </w:r>
+      <w:r>
+        <w:rPr>
+          <w:rFonts w:ascii="Calibri" w:cs="Calibri" w:eastAsia="Calibri" w:hAnsi="Calibri"/>
+        </w:rPr>
+        <w:t xml:space="preserve"> Two listeners fire, and either one alone would do:</w:t>
+      </w:r>
+    </w:p>
+    <w:p>
+      <w:pPr>
+        <w:pStyle w:val="ListParagraph"/>
+        <w:numPr>
+          <w:ilvl w:val="1"/>
+          <w:numId w:val="4"/>
+        </w:numPr>
+        <w:spacing w:after="60"/>
+      </w:pPr>
+      <w:r>
+        <w:rPr>
+          <w:rFonts w:ascii="Consolas" w:cs="Consolas" w:eastAsia="Consolas" w:hAnsi="Consolas"/>
+          <w:sz w:val="20"/>
+          <w:szCs w:val="20"/>
+        </w:rPr>
+        <w:t xml:space="preserve">bc.onmessage</w:t>
+      </w:r>
+      <w:r>
+        <w:rPr>
+          <w:rFonts w:ascii="Calibri" w:cs="Calibri" w:eastAsia="Calibri" w:hAnsi="Calibri"/>
+        </w:rPr>
+        <w:t xml:space="preserve">, from the broadcast (</w:t>
+      </w:r>
+      <w:r>
+        <w:rPr>
+          <w:rFonts w:ascii="Consolas" w:cs="Consolas" w:eastAsia="Consolas" w:hAnsi="Consolas"/>
+          <w:sz w:val="20"/>
+          <w:szCs w:val="20"/>
+        </w:rPr>
+        <w:t xml:space="preserve">90-tabs-store-init.js:27</w:t>
+      </w:r>
+      <w:r>
+        <w:rPr>
+          <w:rFonts w:ascii="Calibri" w:cs="Calibri" w:eastAsia="Calibri" w:hAnsi="Calibri"/>
+        </w:rPr>
+        <w:t xml:space="preserve">)</w:t>
+      </w:r>
+    </w:p>
+    <w:p>
+      <w:pPr>
+        <w:pStyle w:val="ListParagraph"/>
+        <w:numPr>
+          <w:ilvl w:val="1"/>
+          <w:numId w:val="4"/>
+        </w:numPr>
+        <w:spacing w:after="60"/>
+      </w:pPr>
+      <w:r>
+        <w:rPr>
+          <w:rFonts w:ascii="Calibri" w:cs="Calibri" w:eastAsia="Calibri" w:hAnsi="Calibri"/>
+        </w:rPr>
+        <w:t xml:space="preserve">the browser's storage event, which fires when another tab writes to localStorage (</w:t>
+      </w:r>
+      <w:r>
+        <w:rPr>
+          <w:rFonts w:ascii="Consolas" w:cs="Consolas" w:eastAsia="Consolas" w:hAnsi="Consolas"/>
+          <w:sz w:val="20"/>
+          <w:szCs w:val="20"/>
+        </w:rPr>
+        <w:t xml:space="preserve">:26</w:t>
+      </w:r>
+      <w:r>
+        <w:rPr>
+          <w:rFonts w:ascii="Calibri" w:cs="Calibri" w:eastAsia="Calibri" w:hAnsi="Calibri"/>
+        </w:rPr>
+        <w:t xml:space="preserve">)</w:t>
+      </w:r>
+    </w:p>
+    <w:p>
+      <w:pPr>
+        <w:spacing w:after="120"/>
+      </w:pPr>
+      <w:r>
+        <w:rPr>
+          <w:rFonts w:ascii="Calibri" w:cs="Calibri" w:eastAsia="Calibri" w:hAnsi="Calibri"/>
+        </w:rPr>
+        <w:t xml:space="preserve">Both call </w:t>
+      </w:r>
+      <w:r>
+        <w:rPr>
+          <w:rFonts w:ascii="Consolas" w:cs="Consolas" w:eastAsia="Consolas" w:hAnsi="Consolas"/>
+          <w:sz w:val="20"/>
+          <w:szCs w:val="20"/>
+        </w:rPr>
+        <w:t xml:space="preserve">incoming(snapshot)</w:t>
+      </w:r>
+      <w:r>
+        <w:rPr>
+          <w:rFonts w:ascii="Calibri" w:cs="Calibri" w:eastAsia="Calibri" w:hAnsi="Calibri"/>
+        </w:rPr>
+        <w:t xml:space="preserve"> (</w:t>
+      </w:r>
+      <w:r>
+        <w:rPr>
+          <w:rFonts w:ascii="Consolas" w:cs="Consolas" w:eastAsia="Consolas" w:hAnsi="Consolas"/>
+          <w:sz w:val="20"/>
+          <w:szCs w:val="20"/>
+        </w:rPr>
+        <w:t xml:space="preserve">:25</w:t>
+      </w:r>
+      <w:r>
+        <w:rPr>
+          <w:rFonts w:ascii="Calibri" w:cs="Calibri" w:eastAsia="Calibri" w:hAnsi="Calibri"/>
+        </w:rPr>
+        <w:t xml:space="preserve">).</w:t>
+      </w:r>
+    </w:p>
+    <w:p>
+      <w:pPr>
+        <w:spacing w:after="120"/>
+      </w:pPr>
+      <w:r>
+        <w:rPr>
+          <w:rFonts w:ascii="Calibri" w:cs="Calibri" w:eastAsia="Calibri" w:hAnsi="Calibri"/>
+          <w:b/>
+          <w:bCs/>
+        </w:rPr>
+        <w:t xml:space="preserve">8. applySnapshot() replaces its in-memory state</w:t>
+      </w:r>
+      <w:r>
+        <w:rPr>
+          <w:rFonts w:ascii="Calibri" w:cs="Calibri" w:eastAsia="Calibri" w:hAnsi="Calibri"/>
+        </w:rPr>
+        <w:t xml:space="preserve"> (</w:t>
+      </w:r>
+      <w:r>
+        <w:rPr>
+          <w:rFonts w:ascii="Consolas" w:cs="Consolas" w:eastAsia="Consolas" w:hAnsi="Consolas"/>
+          <w:sz w:val="20"/>
+          <w:szCs w:val="20"/>
+        </w:rPr>
+        <w:t xml:space="preserve">:10</w:t>
+      </w:r>
+      <w:r>
+        <w:rPr>
+          <w:rFonts w:ascii="Calibri" w:cs="Calibri" w:eastAsia="Calibri" w:hAnsi="Calibri"/>
+        </w:rPr>
+        <w:t xml:space="preserve">). It swaps in the received workloads, keys, profiles and so on, and keeps the Console's own current key selection.</w:t>
+      </w:r>
+    </w:p>
+    <w:p>
+      <w:pPr>
+        <w:spacing w:after="120"/>
+      </w:pPr>
+      <w:r>
+        <w:rPr>
+          <w:rFonts w:ascii="Calibri" w:cs="Calibri" w:eastAsia="Calibri" w:hAnsi="Calibri"/>
+          <w:b/>
+          <w:bCs/>
+        </w:rPr>
+        <w:t xml:space="preserve">9. refreshConsole() redraws</w:t>
+      </w:r>
+      <w:r>
+        <w:rPr>
+          <w:rFonts w:ascii="Calibri" w:cs="Calibri" w:eastAsia="Calibri" w:hAnsi="Calibri"/>
+        </w:rPr>
+        <w:t xml:space="preserve"> (</w:t>
+      </w:r>
+      <w:r>
+        <w:rPr>
+          <w:rFonts w:ascii="Consolas" w:cs="Consolas" w:eastAsia="Consolas" w:hAnsi="Consolas"/>
+          <w:sz w:val="20"/>
+          <w:szCs w:val="20"/>
+        </w:rPr>
+        <w:t xml:space="preserve">:20</w:t>
+      </w:r>
+      <w:r>
+        <w:rPr>
+          <w:rFonts w:ascii="Calibri" w:cs="Calibri" w:eastAsia="Calibri" w:hAnsi="Calibri"/>
+        </w:rPr>
+        <w:t xml:space="preserve">). It calls:</w:t>
+      </w:r>
+    </w:p>
+    <w:p>
+      <w:pPr>
+        <w:pStyle w:val="ListParagraph"/>
+        <w:numPr>
+          <w:ilvl w:val="1"/>
+          <w:numId w:val="4"/>
+        </w:numPr>
+        <w:spacing w:after="60"/>
+      </w:pPr>
+      <w:r>
+        <w:rPr>
+          <w:rFonts w:ascii="Consolas" w:cs="Consolas" w:eastAsia="Consolas" w:hAnsi="Consolas"/>
+          <w:sz w:val="20"/>
+          <w:szCs w:val="20"/>
+        </w:rPr>
+        <w:t xml:space="preserve">renderProfiles()</w:t>
+      </w:r>
+      <w:r>
+        <w:rPr>
+          <w:rFonts w:ascii="Calibri" w:cs="Calibri" w:eastAsia="Calibri" w:hAnsi="Calibri"/>
+        </w:rPr>
+        <w:t xml:space="preserve">, which updates "Last Used On"</w:t>
+      </w:r>
+    </w:p>
+    <w:p>
+      <w:pPr>
+        <w:pStyle w:val="ListParagraph"/>
+        <w:numPr>
+          <w:ilvl w:val="1"/>
+          <w:numId w:val="4"/>
+        </w:numPr>
+        <w:spacing w:after="60"/>
+      </w:pPr>
+      <w:r>
+        <w:rPr>
+          <w:rFonts w:ascii="Consolas" w:cs="Consolas" w:eastAsia="Consolas" w:hAnsi="Consolas"/>
+          <w:sz w:val="20"/>
+          <w:szCs w:val="20"/>
+        </w:rPr>
+        <w:t xml:space="preserve">renderWorkloads()</w:t>
+      </w:r>
+      <w:r>
+        <w:rPr>
+          <w:rFonts w:ascii="Calibri" w:cs="Calibri" w:eastAsia="Calibri" w:hAnsi="Calibri"/>
+        </w:rPr>
+        <w:t xml:space="preserve"> (</w:t>
+      </w:r>
+      <w:r>
+        <w:rPr>
+          <w:rFonts w:ascii="Consolas" w:cs="Consolas" w:eastAsia="Consolas" w:hAnsi="Consolas"/>
+          <w:sz w:val="20"/>
+          <w:szCs w:val="20"/>
+        </w:rPr>
+        <w:t xml:space="preserve">00-page-core.js:110</w:t>
+      </w:r>
+      <w:r>
+        <w:rPr>
+          <w:rFonts w:ascii="Calibri" w:cs="Calibri" w:eastAsia="Calibri" w:hAnsi="Calibri"/>
+        </w:rPr>
+        <w:t xml:space="preserve">), which rebuilds the Workloads table from </w:t>
+      </w:r>
+      <w:r>
+        <w:rPr>
+          <w:rFonts w:ascii="Consolas" w:cs="Consolas" w:eastAsia="Consolas" w:hAnsi="Consolas"/>
+          <w:sz w:val="20"/>
+          <w:szCs w:val="20"/>
+        </w:rPr>
+        <w:t xml:space="preserve">state.workloads</w:t>
+      </w:r>
+      <w:r>
+        <w:rPr>
+          <w:rFonts w:ascii="Calibri" w:cs="Calibri" w:eastAsia="Calibri" w:hAnsi="Calibri"/>
+        </w:rPr>
+        <w:t xml:space="preserve"> and so adds the linux-ven-01 row</w:t>
+      </w:r>
+    </w:p>
+    <w:p>
+      <w:pPr>
+        <w:pStyle w:val="ListParagraph"/>
+        <w:numPr>
+          <w:ilvl w:val="1"/>
+          <w:numId w:val="4"/>
+        </w:numPr>
+        <w:spacing w:after="60"/>
+      </w:pPr>
+      <w:r>
+        <w:rPr>
+          <w:rFonts w:ascii="Calibri" w:cs="Calibri" w:eastAsia="Calibri" w:hAnsi="Calibri"/>
+        </w:rPr>
+        <w:t xml:space="preserve">an update of "Remaining Uses" if the Pairing Key page is open</w:t>
+      </w:r>
+    </w:p>
+    <w:p>
+      <w:pPr>
+        <w:spacing w:after="120"/>
+      </w:pPr>
+      <w:r>
+        <w:rPr>
+          <w:rFonts w:ascii="Calibri" w:cs="Calibri" w:eastAsia="Calibri" w:hAnsi="Calibri"/>
+          <w:b/>
+          <w:bCs/>
+        </w:rPr>
+        <w:t xml:space="preserve">10. On screen:</w:t>
+      </w:r>
+      <w:r>
+        <w:rPr>
+          <w:rFonts w:ascii="Calibri" w:cs="Calibri" w:eastAsia="Calibri" w:hAnsi="Calibri"/>
+        </w:rPr>
+        <w:t xml:space="preserve"> if the learner is already on Servers &amp; Endpoints › Workloads, the row appears the moment the log reaches "Pairing with Illumio". If they're on another page, it's there when they open Workloads.</w:t>
+      </w:r>
+    </w:p>
+    <w:p>
+      <w:pPr>
+        <w:pStyle w:val="Heading2"/>
+        <w:spacing w:after="100" w:before="200"/>
+      </w:pPr>
+      <w:r>
+        <w:rPr>
+          <w:rFonts w:ascii="Calibri" w:cs="Calibri" w:eastAsia="Calibri" w:hAnsi="Calibri"/>
+        </w:rPr>
+        <w:t xml:space="preserve">In one line</w:t>
+      </w:r>
+    </w:p>
+    <w:p>
+      <w:pPr>
+        <w:shd w:fill="F2F4F7" w:color="auto" w:val="clear"/>
+        <w:spacing w:after="0"/>
+      </w:pPr>
+      <w:r>
+        <w:rPr>
+          <w:rFonts w:ascii="Consolas" w:cs="Consolas" w:eastAsia="Consolas" w:hAnsi="Consolas"/>
+          <w:sz w:val="18"/>
+          <w:szCs w:val="18"/>
+        </w:rPr>
+        <w:t xml:space="preserve">Enter → runCommand → load() → validate key → stream(log) → {pair:true} → pairWorkload → save()</w:t>
+      </w:r>
+    </w:p>
+    <w:p>
+      <w:pPr>
+        <w:shd w:fill="F2F4F7" w:color="auto" w:val="clear"/>
+        <w:spacing w:after="0"/>
+      </w:pPr>
+      <w:r>
+        <w:rPr>
+          <w:rFonts w:ascii="Consolas" w:cs="Consolas" w:eastAsia="Consolas" w:hAnsi="Consolas"/>
+          <w:sz w:val="18"/>
+          <w:szCs w:val="18"/>
+        </w:rPr>
+        <w:t xml:space="preserve">      → localStorage + BroadcastChannel ──→ Console: incoming → applySnapshot → refreshConsole → renderWorkloads</w:t>
+      </w:r>
+    </w:p>
+    <w:p>
+      <w:pPr>
+        <w:shd w:fill="F2F4F7" w:color="auto" w:val="clear"/>
+        <w:spacing w:after="0"/>
+      </w:pPr>
+      <w:r>
+        <w:rPr>
+          <w:rFonts w:ascii="Consolas" w:cs="Consolas" w:eastAsia="Consolas" w:hAnsi="Consolas"/>
+          <w:sz w:val="18"/>
+          <w:szCs w:val="18"/>
+        </w:rPr>
+        <w:t xml:space="preserve">      → POST /api/state (check scripts only)</w:t>
+      </w:r>
+    </w:p>
+    <w:p>
+      <w:pPr>
+        <w:spacing w:after="120"/>
+      </w:pPr>
+    </w:p>
+    <w:p>
+      <w:pPr>
+        <w:pStyle w:val="Heading1"/>
+        <w:spacing w:after="120" w:before="280"/>
+      </w:pPr>
+      <w:r>
+        <w:rPr>
+          <w:rFonts w:ascii="Calibri" w:cs="Calibri" w:eastAsia="Calibri" w:hAnsi="Calibri"/>
+        </w:rPr>
         <w:t xml:space="preserve">Notes</w:t>
       </w:r>
     </w:p>
@@ -1862,6 +2986,18 @@
     </w:lvl>
   </w:abstractNum>
   <w:abstractNum w:abstractNumId="5" w15:restartNumberingAfterBreak="0">
+    <w:multiLevelType w:val="hybridMultilevel"/>
+    <w:lvl w:ilvl="0" w:tentative="1">
+      <w:start w:val="1"/>
+      <w:numFmt w:val="decimal"/>
+      <w:lvlText w:val="%1."/>
+      <w:lvlJc w:val="left"/>
+      <w:pPr>
+        <w:ind w:left="720" w:hanging="360"/>
+      </w:pPr>
+    </w:lvl>
+  </w:abstractNum>
+  <w:abstractNum w:abstractNumId="6" w15:restartNumberingAfterBreak="0">
     <w:multiLevelType w:val="hybridMultilevel"/>
     <w:lvl w:ilvl="0" w:tentative="1">
       <w:start w:val="1"/>
@@ -1899,6 +3035,12 @@
   </w:num>
   <w:num w:numId="5">
     <w:abstractNumId w:val="5"/>
+    <w:lvlOverride w:ilvl="0">
+      <w:startOverride w:val="1"/>
+    </w:lvlOverride>
+  </w:num>
+  <w:num w:numId="6">
+    <w:abstractNumId w:val="6"/>
     <w:lvlOverride w:ilvl="0">
       <w:startOverride w:val="1"/>
     </w:lvlOverride>

</xml_diff>